<commit_message>
nocoly: all three print templates live, filtered by status, renamed to MyTech
Co-Authored-By: Claude Opus 5 <noreply@anthropic.com>
</commit_message>
<xml_diff>
--- a/nocoly/print-templates/quotation_order_template.docx
+++ b/nocoly/print-templates/quotation_order_template.docx
@@ -13,7 +13,7 @@
           <w:sz w:val="32"/>
           <w:szCs w:val="32"/>
         </w:rPr>
-        <w:t xml:space="preserve">casimir</w:t>
+        <w:t xml:space="preserve">MyTech Products &amp; Services</w:t>
       </w:r>
     </w:p>
     <w:p>
@@ -1031,7 +1031,7 @@
         <w:sz w:val="16"/>
         <w:szCs w:val="16"/>
       </w:rPr>
-      <w:t xml:space="preserve">casimir · Malaysia      Page </w:t>
+      <w:t xml:space="preserve">MyTech Products &amp; Services · Malaysia      Page </w:t>
     </w:r>
     <w:fldSimple w:instr=" PAGE ">
       <w:r>

</xml_diff>